<commit_message>
Ajustes tras el primer lote del Taller MAS
- anotar_pdf: los bordes verticales delgados cuentan como ocupados y el
  puntaje puede ir justo bajo el borde superior de su celda (antes salía
  de la celda cuando la tabla la llenaba).
- Pauta MAS: criterios homologados del primer lote.

Co-Authored-By: Claude Opus 5.5 <noreply@anthropic.com>
Claude-Session: https://claude.ai/code/session_01EwW5SdpFdcaZozTeTFtc6Z
</commit_message>
<xml_diff>
--- a/mas/pauta/Pauta_Taller_MAS.docx
+++ b/mas/pauta/Pauta_Taller_MAS.docx
@@ -2886,6 +2886,299 @@
         <w:pStyle w:val="Heading2"/>
       </w:pPr>
       <w:r>
+        <w:t>Criterios homologados (decididos al corregir el primer lote)</w:t>
+      </w:r>
+    </w:p>
+    <w:tbl>
+      <w:tblPr>
+        <w:tblStyle w:val="TableGrid"/>
+        <w:tblW w:type="auto" w:w="0"/>
+        <w:jc w:val="center"/>
+        <w:tblLook w:firstColumn="1" w:firstRow="1" w:lastColumn="0" w:lastRow="0" w:noHBand="0" w:noVBand="1" w:val="04A0"/>
+      </w:tblPr>
+      <w:tblGrid>
+        <w:gridCol w:w="4986"/>
+        <w:gridCol w:w="4986"/>
+      </w:tblGrid>
+      <w:tr>
+        <w:tc>
+          <w:tcPr>
+            <w:tcW w:type="dxa" w:w="1247"/>
+            <w:shd w:val="clear" w:color="auto" w:fill="D9E2F3"/>
+          </w:tcPr>
+          <w:p>
+            <w:r>
+              <w:rPr>
+                <w:b/>
+                <w:sz w:val="19"/>
+              </w:rPr>
+              <w:t>Situación</w:t>
+            </w:r>
+          </w:p>
+        </w:tc>
+        <w:tc>
+          <w:tcPr>
+            <w:tcW w:type="dxa" w:w="7824"/>
+            <w:shd w:val="clear" w:color="auto" w:fill="D9E2F3"/>
+          </w:tcPr>
+          <w:p>
+            <w:r>
+              <w:rPr>
+                <w:b/>
+                <w:sz w:val="19"/>
+              </w:rPr>
+              <w:t>Criterio</w:t>
+            </w:r>
+          </w:p>
+        </w:tc>
+      </w:tr>
+      <w:tr>
+        <w:tc>
+          <w:tcPr>
+            <w:tcW w:type="dxa" w:w="1247"/>
+          </w:tcPr>
+          <w:p>
+            <w:r>
+              <w:rPr>
+                <w:b w:val="0"/>
+                <w:sz w:val="19"/>
+              </w:rPr>
+              <w:t>Conclusión P2: compara k₁ y k₂ con sus valores numéricos pero sin calcular la diferencia porcentual</w:t>
+            </w:r>
+          </w:p>
+        </w:tc>
+        <w:tc>
+          <w:tcPr>
+            <w:tcW w:type="dxa" w:w="7824"/>
+          </w:tcPr>
+          <w:p>
+            <w:r>
+              <w:rPr>
+                <w:b w:val="0"/>
+                <w:sz w:val="19"/>
+              </w:rPr>
+              <w:t>1/3 en el criterio de diferencia porcentual.</w:t>
+            </w:r>
+          </w:p>
+        </w:tc>
+      </w:tr>
+      <w:tr>
+        <w:tc>
+          <w:tcPr>
+            <w:tcW w:type="dxa" w:w="1247"/>
+          </w:tcPr>
+          <w:p>
+            <w:r>
+              <w:rPr>
+                <w:b w:val="0"/>
+                <w:sz w:val="19"/>
+              </w:rPr>
+              <w:t>Conclusión P2: juicio de consistencia</w:t>
+            </w:r>
+          </w:p>
+        </w:tc>
+        <w:tc>
+          <w:tcPr>
+            <w:tcW w:type="dxa" w:w="7824"/>
+          </w:tcPr>
+          <w:p>
+            <w:r>
+              <w:rPr>
+                <w:b w:val="0"/>
+                <w:sz w:val="19"/>
+              </w:rPr>
+              <w:t>3 = juicio explícito y correcto respecto del ~10 % (una diferencia de 10–11 % se considera dentro); 2 = juicio vago ("del mismo orden"); 0 = sin juicio o contradictorio con los datos (p. ej. "cercanas" con ~18 % de diferencia).</w:t>
+            </w:r>
+          </w:p>
+        </w:tc>
+      </w:tr>
+      <w:tr>
+        <w:tc>
+          <w:tcPr>
+            <w:tcW w:type="dxa" w:w="1247"/>
+          </w:tcPr>
+          <w:p>
+            <w:r>
+              <w:rPr>
+                <w:b w:val="0"/>
+                <w:sz w:val="19"/>
+              </w:rPr>
+              <w:t>Conclusión P2: causas</w:t>
+            </w:r>
+          </w:p>
+        </w:tc>
+        <w:tc>
+          <w:tcPr>
+            <w:tcW w:type="dxa" w:w="7824"/>
+          </w:tcPr>
+          <w:p>
+            <w:r>
+              <w:rPr>
+                <w:b w:val="0"/>
+                <w:sz w:val="19"/>
+              </w:rPr>
+              <w:t>5 = dos o más causas concretas ligadas a sus datos (puntos que se alejan de la recta, intercepto, masa del resorte, tensión inicial); 4 = dos o más causas concretas de la lista, sin ligarlas a sus datos; 3 = una causa concreta ligada a sus datos, o una coherente y otra que contradice sus datos; 2 = una causa concreta sin ligar; 0 = solo "errores experimentales / de medición".</w:t>
+            </w:r>
+          </w:p>
+        </w:tc>
+      </w:tr>
+      <w:tr>
+        <w:tc>
+          <w:tcPr>
+            <w:tcW w:type="dxa" w:w="1247"/>
+          </w:tcPr>
+          <w:p>
+            <w:r>
+              <w:rPr>
+                <w:b w:val="0"/>
+                <w:sz w:val="19"/>
+              </w:rPr>
+              <w:t>Relación algebraica pedida en un ítem pero escrita solo en otro (o solo en el gráfico)</w:t>
+            </w:r>
+          </w:p>
+        </w:tc>
+        <w:tc>
+          <w:tcPr>
+            <w:tcW w:type="dxa" w:w="7824"/>
+          </w:tcPr>
+          <w:p>
+            <w:r>
+              <w:rPr>
+                <w:b w:val="0"/>
+                <w:sz w:val="19"/>
+              </w:rPr>
+              <w:t>1 pt en ese criterio ("la menciona sin números").</w:t>
+            </w:r>
+          </w:p>
+        </w:tc>
+      </w:tr>
+      <w:tr>
+        <w:tc>
+          <w:tcPr>
+            <w:tcW w:type="dxa" w:w="1247"/>
+          </w:tcPr>
+          <w:p>
+            <w:r>
+              <w:rPr>
+                <w:b w:val="0"/>
+                <w:sz w:val="19"/>
+              </w:rPr>
+              <w:t>Análisis P1 sin comentar un intercepto grande del gráfico 1</w:t>
+            </w:r>
+          </w:p>
+        </w:tc>
+        <w:tc>
+          <w:tcPr>
+            <w:tcW w:type="dxa" w:w="7824"/>
+          </w:tcPr>
+          <w:p>
+            <w:r>
+              <w:rPr>
+                <w:b w:val="0"/>
+                <w:sz w:val="19"/>
+              </w:rPr>
+              <w:t>Sin descuento si juzga con R² o ley de Hooke (el intercepto puede deberse a la tensión inicial del resorte).</w:t>
+            </w:r>
+          </w:p>
+        </w:tc>
+      </w:tr>
+      <w:tr>
+        <w:tc>
+          <w:tcPr>
+            <w:tcW w:type="dxa" w:w="1247"/>
+          </w:tcPr>
+          <w:p>
+            <w:r>
+              <w:rPr>
+                <w:b w:val="0"/>
+                <w:sz w:val="19"/>
+              </w:rPr>
+              <w:t>Un valor de F mal copiado en la Tabla 1 que no afecta al gráfico</w:t>
+            </w:r>
+          </w:p>
+        </w:tc>
+        <w:tc>
+          <w:tcPr>
+            <w:tcW w:type="dxa" w:w="7824"/>
+          </w:tcPr>
+          <w:p>
+            <w:r>
+              <w:rPr>
+                <w:b w:val="0"/>
+                <w:sz w:val="19"/>
+              </w:rPr>
+              <w:t>−1 por fila, como dice la pauta.</w:t>
+            </w:r>
+          </w:p>
+        </w:tc>
+      </w:tr>
+      <w:tr>
+        <w:tc>
+          <w:tcPr>
+            <w:tcW w:type="dxa" w:w="1247"/>
+          </w:tcPr>
+          <w:p>
+            <w:r>
+              <w:rPr>
+                <w:b w:val="0"/>
+                <w:sz w:val="19"/>
+              </w:rPr>
+              <w:t>Punto (0,0) agregado a las tablas o gráficos</w:t>
+            </w:r>
+          </w:p>
+        </w:tc>
+        <w:tc>
+          <w:tcPr>
+            <w:tcW w:type="dxa" w:w="7824"/>
+          </w:tcPr>
+          <w:p>
+            <w:r>
+              <w:rPr>
+                <w:b w:val="0"/>
+                <w:sz w:val="19"/>
+              </w:rPr>
+              <w:t>No se descuenta en la tabla ni en k; su efecto en los resultados se evalúa en las causas de la conclusión.</w:t>
+            </w:r>
+          </w:p>
+        </w:tc>
+      </w:tr>
+      <w:tr>
+        <w:tc>
+          <w:tcPr>
+            <w:tcW w:type="dxa" w:w="1247"/>
+          </w:tcPr>
+          <w:p>
+            <w:r>
+              <w:rPr>
+                <w:b w:val="0"/>
+                <w:sz w:val="19"/>
+              </w:rPr>
+              <w:t>k₂ correcto sin escribir la relación pendiente = 4π²/k</w:t>
+            </w:r>
+          </w:p>
+        </w:tc>
+        <w:tc>
+          <w:tcPr>
+            <w:tcW w:type="dxa" w:w="7824"/>
+          </w:tcPr>
+          <w:p>
+            <w:r>
+              <w:rPr>
+                <w:b w:val="0"/>
+                <w:sz w:val="19"/>
+              </w:rPr>
+              <w:t>1/3 en ese criterio.</w:t>
+            </w:r>
+          </w:p>
+        </w:tc>
+      </w:tr>
+    </w:tbl>
+    <w:p/>
+    <w:p>
+      <w:pPr>
+        <w:pStyle w:val="Heading2"/>
+      </w:pPr>
+      <w:r>
         <w:t>Formato del informe de revisión</w:t>
       </w:r>
     </w:p>

</xml_diff>

<commit_message>
MAS: pauta más estricta y comentarios verdes para el docente
- Pauta: se descuentan puntos inventados (como (0,0)), ajustes que no
  representan los datos y análisis que no reconocen o contradicen sus
  datos; nuevo criterio 'el ajuste representa los datos' en los gráficos.
- anotar_pdf: campo 'justificacion' por ítem, escrito en verde (para el
  docente), además del comentario rojo para el estudiante.
- Agente revisor-mas: aplica la pauta estricta y escribe la justificación
  verde en todos los ítems.

Co-Authored-By: Claude Opus 5.5 <noreply@anthropic.com>
Claude-Session: https://claude.ai/code/session_01EwW5SdpFdcaZozTeTFtc6Z
</commit_message>
<xml_diff>
--- a/mas/pauta/Pauta_Taller_MAS.docx
+++ b/mas/pauta/Pauta_Taller_MAS.docx
@@ -65,13 +65,75 @@
         <w:rPr>
           <w:b/>
         </w:rPr>
-        <w:t>Criterio del docente sobre los datos:</w:t>
+        <w:t>Criterio del docente (actualizado tras el primer lote): pauta estricta en método, gráficos y análisis.</w:t>
       </w:r>
       <w:r>
         <w:rPr>
           <w:b w:val="0"/>
         </w:rPr>
-        <w:t xml:space="preserve"> exigencia baja. Se acepta el error humano (tiempo de reacción, lectura de la regla): no se descuenta por dispersión de los datos ni por un R² moderado. Se evalúa el método, los cálculos y que el análisis sea coherente con los propios datos.</w:t>
+        <w:t xml:space="preserve"> Se tolera el error humano propio de las mediciones (tiempo de reacción, lectura de la regla), pero </w:t>
+      </w:r>
+      <w:r>
+        <w:rPr>
+          <w:b/>
+        </w:rPr>
+        <w:t>se descuenta</w:t>
+      </w:r>
+      <w:r>
+        <w:rPr>
+          <w:b w:val="0"/>
+        </w:rPr>
+        <w:t>:</w:t>
+      </w:r>
+    </w:p>
+    <w:p>
+      <w:pPr>
+        <w:pStyle w:val="ListBullet"/>
+      </w:pPr>
+      <w:r>
+        <w:rPr>
+          <w:b w:val="0"/>
+        </w:rPr>
+        <w:t>inventar o agregar puntos que no son mediciones (por ejemplo una fila o un punto (0,0));</w:t>
+      </w:r>
+    </w:p>
+    <w:p>
+      <w:pPr>
+        <w:pStyle w:val="ListBullet"/>
+      </w:pPr>
+      <w:r>
+        <w:rPr>
+          <w:b w:val="0"/>
+        </w:rPr>
+        <w:t>un ajuste o gráfico que no representa los datos (puntos que no siguen la recta por un error de método, escalas o ejes mal leídos);</w:t>
+      </w:r>
+    </w:p>
+    <w:p>
+      <w:pPr>
+        <w:pStyle w:val="ListBullet"/>
+      </w:pPr>
+      <w:r>
+        <w:rPr>
+          <w:b w:val="0"/>
+        </w:rPr>
+        <w:t>un análisis que no reconoce o contradice lo que muestran sus propios datos (llamar "clara tendencia recta" a un ajuste con R² = 0,87, no comentar un intercepto grande, decir "cercanas" a constantes que difieren más de 10 %).</w:t>
+      </w:r>
+    </w:p>
+    <w:p>
+      <w:pPr>
+        <w:jc w:val="both"/>
+      </w:pPr>
+      <w:r>
+        <w:rPr>
+          <w:b/>
+        </w:rPr>
+        <w:t>Cada punto otorgado debe estar respaldado por algo escrito o visible en el taller.</w:t>
+      </w:r>
+      <w:r>
+        <w:rPr>
+          <w:b w:val="0"/>
+        </w:rPr>
+        <w:t xml:space="preserve"> Ante la duda no se completa lo que el grupo no escribió.</w:t>
       </w:r>
     </w:p>
     <w:p>
@@ -1226,7 +1288,21 @@
                 <w:b w:val="0"/>
                 <w:sz w:val="19"/>
               </w:rPr>
-              <w:t>Al menos 5 mediciones con masas distintas (la plantilla tiene 6). 1 si tiene 3 o 4.</w:t>
+              <w:t xml:space="preserve">Al menos 5 </w:t>
+            </w:r>
+            <w:r>
+              <w:rPr>
+                <w:b/>
+                <w:sz w:val="19"/>
+              </w:rPr>
+              <w:t>mediciones reales</w:t>
+            </w:r>
+            <w:r>
+              <w:rPr>
+                <w:b w:val="0"/>
+                <w:sz w:val="19"/>
+              </w:rPr>
+              <w:t xml:space="preserve"> con masas distintas (la plantilla tiene 6). Una fila (0, 0, 0) agregada no es una medición: no cuenta y descuenta 1. 1 si quedan 3 o 4 mediciones.</w:t>
             </w:r>
           </w:p>
         </w:tc>
@@ -1410,7 +1486,7 @@
                 <w:b w:val="0"/>
                 <w:sz w:val="19"/>
               </w:rPr>
-              <w:t>2</w:t>
+              <w:t>1</w:t>
             </w:r>
           </w:p>
         </w:tc>
@@ -1484,7 +1560,7 @@
                 <w:b w:val="0"/>
                 <w:sz w:val="19"/>
               </w:rPr>
-              <w:t>Línea de tendencia lineal con su ecuación visible.</w:t>
+              <w:t>Línea de tendencia lineal con su ecuación y R² visibles (1 si falta uno de los dos).</w:t>
             </w:r>
           </w:p>
         </w:tc>
@@ -1500,7 +1576,7 @@
                 <w:b w:val="0"/>
                 <w:sz w:val="19"/>
               </w:rPr>
-              <w:t>2</w:t>
+              <w:t>3</w:t>
             </w:r>
           </w:p>
         </w:tc>
@@ -1511,10 +1587,17 @@
           <w:p>
             <w:r>
               <w:rPr>
+                <w:b/>
+                <w:sz w:val="19"/>
+              </w:rPr>
+              <w:t>El ajuste representa los datos medidos</w:t>
+            </w:r>
+            <w:r>
+              <w:rPr>
                 <w:b w:val="0"/>
                 <w:sz w:val="19"/>
               </w:rPr>
-              <w:t>R² visible.</w:t>
+              <w:t>: solo puntos medidos (sin puntos inventados como (0,0)), los puntos siguen la recta y la ecuación corresponde a esos datos. 0 si se agregó un punto que no es medición y altera la recta, o si la recta no representa los datos por un error de método. 1–2 si hay un problema menor (un punto mal graficado, escala que dificulta la lectura).</w:t>
             </w:r>
           </w:p>
         </w:tc>
@@ -1754,7 +1837,21 @@
                 <w:b w:val="0"/>
                 <w:sz w:val="19"/>
               </w:rPr>
-              <w:t>Juzga si los datos son acordes a lo esperado con criterio: linealidad (R²), intercepto cercano a cero, relación con la ley de Hooke o la hipótesis.</w:t>
+              <w:t xml:space="preserve">Juzga si los datos son acordes a lo esperado con un criterio </w:t>
+            </w:r>
+            <w:r>
+              <w:rPr>
+                <w:b/>
+                <w:sz w:val="19"/>
+              </w:rPr>
+              <w:t>coherente con sus datos</w:t>
+            </w:r>
+            <w:r>
+              <w:rPr>
+                <w:b w:val="0"/>
+                <w:sz w:val="19"/>
+              </w:rPr>
+              <w:t>: linealidad (R²) y relación con la ley de Hooke o la hipótesis. Si el intercepto o un punto se apartan claramente (por ejemplo intercepto mayor al 10 % de la deformación máxima, R² &lt; 0,98), debe reconocerlo y explicarlo (p. ej. tensión inicial del resorte): 1 si no lo comenta. 0 si el juicio contradice los datos ("clara tendencia recta" con R² = 0,87).</w:t>
             </w:r>
           </w:p>
         </w:tc>
@@ -2015,7 +2112,21 @@
                 <w:b w:val="0"/>
                 <w:sz w:val="19"/>
               </w:rPr>
-              <w:t>Al menos 6 mediciones con masas distintas (la plantilla tiene 8). 1 si tiene 4 o 5.</w:t>
+              <w:t xml:space="preserve">Al menos 6 </w:t>
+            </w:r>
+            <w:r>
+              <w:rPr>
+                <w:b/>
+                <w:sz w:val="19"/>
+              </w:rPr>
+              <w:t>mediciones reales</w:t>
+            </w:r>
+            <w:r>
+              <w:rPr>
+                <w:b w:val="0"/>
+                <w:sz w:val="19"/>
+              </w:rPr>
+              <w:t xml:space="preserve"> con masas distintas (la plantilla tiene 8). Una fila (0, 0, 0) agregada no es una medición (con masa cero el resorte también oscila): no cuenta y descuenta 1. 1 si quedan 4 o 5 mediciones.</w:t>
             </w:r>
           </w:p>
         </w:tc>
@@ -2218,7 +2329,7 @@
                 <w:b w:val="0"/>
                 <w:sz w:val="19"/>
               </w:rPr>
-              <w:t>2</w:t>
+              <w:t>1</w:t>
             </w:r>
           </w:p>
         </w:tc>
@@ -2292,7 +2403,7 @@
                 <w:b w:val="0"/>
                 <w:sz w:val="19"/>
               </w:rPr>
-              <w:t>Línea de tendencia lineal con ecuación.</w:t>
+              <w:t>Línea de tendencia lineal con ecuación y R² visibles (1 si falta uno de los dos).</w:t>
             </w:r>
           </w:p>
         </w:tc>
@@ -2308,7 +2419,7 @@
                 <w:b w:val="0"/>
                 <w:sz w:val="19"/>
               </w:rPr>
-              <w:t>2</w:t>
+              <w:t>3</w:t>
             </w:r>
           </w:p>
         </w:tc>
@@ -2319,10 +2430,17 @@
           <w:p>
             <w:r>
               <w:rPr>
+                <w:b/>
+                <w:sz w:val="19"/>
+              </w:rPr>
+              <w:t>El ajuste representa los datos medidos</w:t>
+            </w:r>
+            <w:r>
+              <w:rPr>
                 <w:b w:val="0"/>
                 <w:sz w:val="19"/>
               </w:rPr>
-              <w:t>R² visible.</w:t>
+              <w:t>: sin puntos inventados (como (0,0)), los puntos siguen la recta y la ecuación corresponde a esos datos. 0 si se agregó un punto que no es medición y altera la recta o el intercepto, o si la recta no representa los datos por un error de método. 1–2 si hay un problema menor.</w:t>
             </w:r>
           </w:p>
         </w:tc>
@@ -2844,7 +2962,24 @@
         <w:rPr>
           <w:b w:val="0"/>
         </w:rPr>
-        <w:t>: no se descuenta por dispersión ni R² moderado; sí si el análisis contradice los propios datos.</w:t>
+        <w:t>: se tolera la dispersión propia de las mediciones, pero se descuentan los puntos inventados, los ajustes que no representan los datos y los análisis que no reconocen o contradicen lo que muestran sus propios datos.</w:t>
+      </w:r>
+    </w:p>
+    <w:p>
+      <w:pPr>
+        <w:pStyle w:val="ListNumber"/>
+      </w:pPr>
+      <w:r>
+        <w:rPr>
+          <w:b/>
+        </w:rPr>
+        <w:t>Sin crédito por suposición</w:t>
+      </w:r>
+      <w:r>
+        <w:rPr>
+          <w:b w:val="0"/>
+        </w:rPr>
+        <w:t>: cada punto otorgado debe estar respaldado por lo escrito o graficado. No se completa lo que el grupo no escribió ni se da el beneficio de la duda en lo conceptual.</w:t>
       </w:r>
     </w:p>
     <w:p>
@@ -3077,7 +3212,7 @@
                 <w:b w:val="0"/>
                 <w:sz w:val="19"/>
               </w:rPr>
-              <w:t>Sin descuento si juzga con R² o ley de Hooke (el intercepto puede deberse a la tensión inicial del resorte).</w:t>
+              <w:t>Reemplazado por el criterio estricto: 1/3 en el juicio si no lo comenta (el intercepto puede deberse a la tensión inicial del resorte, y eso es lo que debe explicar).</w:t>
             </w:r>
           </w:p>
         </w:tc>
@@ -3137,7 +3272,7 @@
                 <w:b w:val="0"/>
                 <w:sz w:val="19"/>
               </w:rPr>
-              <w:t>No se descuenta en la tabla ni en k; su efecto en los resultados se evalúa en las causas de la conclusión.</w:t>
+              <w:t>Reemplazado por el criterio estricto: −1 en la tabla y 0/3 en "el ajuste representa los datos" del gráfico si altera la recta. k se corrige con su pendiente (arrastre).</w:t>
             </w:r>
           </w:p>
         </w:tc>

</xml_diff>

<commit_message>
Anotador: reserva el puntaje antes de ubicar comentarios; homologa criterios MAS
- comun/anotar_pdf.py: el puntaje de cada ítem se ubica primero (queda dentro
  de su celda) y los comentarios lo evitan.
- Pauta MAS: criterios homologados para el (0,0) en el gráfico 2, el juicio
  del Análisis P1 y el juicio del gráfico 2 en la conclusión.

Co-Authored-By: Claude Opus 5.5 <noreply@anthropic.com>
Claude-Session: https://claude.ai/code/session_01EwW5SdpFdcaZozTeTFtc6Z
</commit_message>
<xml_diff>
--- a/mas/pauta/Pauta_Taller_MAS.docx
+++ b/mas/pauta/Pauta_Taller_MAS.docx
@@ -3307,6 +3307,96 @@
           </w:p>
         </w:tc>
       </w:tr>
+      <w:tr>
+        <w:tc>
+          <w:tcPr>
+            <w:tcW w:type="dxa" w:w="1247"/>
+          </w:tcPr>
+          <w:p>
+            <w:r>
+              <w:rPr>
+                <w:b w:val="0"/>
+                <w:sz w:val="19"/>
+              </w:rPr>
+              <w:t>Punto (0,0) agregado al gráfico 2 que casi no cambia la pendiente pero sí el intercepto o el R²</w:t>
+            </w:r>
+          </w:p>
+        </w:tc>
+        <w:tc>
+          <w:tcPr>
+            <w:tcW w:type="dxa" w:w="7824"/>
+          </w:tcPr>
+          <w:p>
+            <w:r>
+              <w:rPr>
+                <w:b w:val="0"/>
+                <w:sz w:val="19"/>
+              </w:rPr>
+              <w:t>0/3 en "el ajuste representa los datos", igual que en el gráfico 1 (lectura literal de la pauta).</w:t>
+            </w:r>
+          </w:p>
+        </w:tc>
+      </w:tr>
+      <w:tr>
+        <w:tc>
+          <w:tcPr>
+            <w:tcW w:type="dxa" w:w="1247"/>
+          </w:tcPr>
+          <w:p>
+            <w:r>
+              <w:rPr>
+                <w:b w:val="0"/>
+                <w:sz w:val="19"/>
+              </w:rPr>
+              <w:t>Análisis P1: afirma proporcionalidad o "como dice la ley de Hooke" sin comentar un intercepto grande</w:t>
+            </w:r>
+          </w:p>
+        </w:tc>
+        <w:tc>
+          <w:tcPr>
+            <w:tcW w:type="dxa" w:w="7824"/>
+          </w:tcPr>
+          <w:p>
+            <w:r>
+              <w:rPr>
+                <w:b w:val="0"/>
+                <w:sz w:val="19"/>
+              </w:rPr>
+              <w:t>1/3 en el juicio (la omisión del intercepto ya es el descuento). 0/3 se reserva para un juicio de linealidad que contradice el R² ("clara tendencia recta" con R² = 0,87).</w:t>
+            </w:r>
+          </w:p>
+        </w:tc>
+      </w:tr>
+      <w:tr>
+        <w:tc>
+          <w:tcPr>
+            <w:tcW w:type="dxa" w:w="1247"/>
+          </w:tcPr>
+          <w:p>
+            <w:r>
+              <w:rPr>
+                <w:b w:val="0"/>
+                <w:sz w:val="19"/>
+              </w:rPr>
+              <w:t>Conclusión P2: juicio del gráfico 2 que no reconoce lo que muestran sus datos</w:t>
+            </w:r>
+          </w:p>
+        </w:tc>
+        <w:tc>
+          <w:tcPr>
+            <w:tcW w:type="dxa" w:w="7824"/>
+          </w:tcPr>
+          <w:p>
+            <w:r>
+              <w:rPr>
+                <w:b w:val="0"/>
+                <w:sz w:val="19"/>
+              </w:rPr>
+              <w:t>−2 por cada aspecto no reconocido: R² &lt; 0,98; intercepto (positivo o negativo) mayor al 10 % del T² máximo. Bajo esos umbrales no se descuenta en el juicio.</w:t>
+            </w:r>
+          </w:p>
+        </w:tc>
+      </w:tr>
     </w:tbl>
     <w:p/>
     <w:p>

</xml_diff>